<commit_message>
Polish variant listing and report
</commit_message>
<xml_diff>
--- a/Стакалов_АА_ИУ5-12-4_ЛР2_Алгоритмизация_программирование_2026.docx
+++ b/Стакалов_АА_ИУ5-12-4_ЛР2_Алгоритмизация_программирование_2026.docx
@@ -1426,14 +1426,6 @@
     </w:p>
     <w:p>
       <w:pPr>
-        <w:ind w:firstLine="0"/>
-      </w:pPr>
-      <w:r>
-        <w:br w:type="page"/>
-      </w:r>
-    </w:p>
-    <w:p>
-      <w:pPr>
         <w:keepNext/>
         <w:spacing w:before="200" w:after="120" w:line="276" w:lineRule="auto"/>
         <w:ind w:firstLine="0"/>
@@ -1980,7 +1972,7 @@
       <w:r>
         <w:rPr>
           <w:rFonts w:ascii="Courier New" w:hAnsi="Courier New" w:eastAsia="Courier New"/>
-          <w:sz w:val="20"/>
+          <w:sz w:val="24"/>
         </w:rPr>
         <w:t>std::vector&lt;int&gt; sorted(arr, arr + n);</w:t>
       </w:r>
@@ -1990,7 +1982,7 @@
       <w:r>
         <w:rPr>
           <w:rFonts w:ascii="Courier New" w:hAnsi="Courier New" w:eastAsia="Courier New"/>
-          <w:sz w:val="20"/>
+          <w:sz w:val="24"/>
         </w:rPr>
         <w:t>std::sort(sorted.begin(), sorted.end());</w:t>
       </w:r>
@@ -2000,7 +1992,7 @@
       <w:r>
         <w:rPr>
           <w:rFonts w:ascii="Courier New" w:hAnsi="Courier New" w:eastAsia="Courier New"/>
-          <w:sz w:val="20"/>
+          <w:sz w:val="24"/>
         </w:rPr>
         <w:t>const std::size_t middle = n / 2;</w:t>
       </w:r>
@@ -2010,7 +2002,7 @@
       <w:r>
         <w:rPr>
           <w:rFonts w:ascii="Courier New" w:hAnsi="Courier New" w:eastAsia="Courier New"/>
-          <w:sz w:val="20"/>
+          <w:sz w:val="24"/>
         </w:rPr>
         <w:t>if (n % 2 != 0) return sorted[middle];</w:t>
       </w:r>
@@ -2020,7 +2012,7 @@
       <w:r>
         <w:rPr>
           <w:rFonts w:ascii="Courier New" w:hAnsi="Courier New" w:eastAsia="Courier New"/>
-          <w:sz w:val="20"/>
+          <w:sz w:val="24"/>
         </w:rPr>
         <w:t>return (static_cast&lt;double&gt;(sorted[middle - 1]) +</w:t>
       </w:r>
@@ -2030,7 +2022,7 @@
       <w:r>
         <w:rPr>
           <w:rFonts w:ascii="Courier New" w:hAnsi="Courier New" w:eastAsia="Courier New"/>
-          <w:sz w:val="20"/>
+          <w:sz w:val="24"/>
         </w:rPr>
         <w:t xml:space="preserve">        sorted[middle]) / 2.0;</w:t>
       </w:r>
@@ -2105,7 +2097,7 @@
       <w:r>
         <w:rPr>
           <w:rFonts w:ascii="Courier New" w:hAnsi="Courier New" w:eastAsia="Courier New"/>
-          <w:sz w:val="20"/>
+          <w:sz w:val="24"/>
         </w:rPr>
         <w:t>cmake -S . -B build</w:t>
       </w:r>
@@ -2115,7 +2107,7 @@
       <w:r>
         <w:rPr>
           <w:rFonts w:ascii="Courier New" w:hAnsi="Courier New" w:eastAsia="Courier New"/>
-          <w:sz w:val="20"/>
+          <w:sz w:val="24"/>
         </w:rPr>
         <w:t>cmake --build build</w:t>
       </w:r>
@@ -2125,7 +2117,7 @@
       <w:r>
         <w:rPr>
           <w:rFonts w:ascii="Courier New" w:hAnsi="Courier New" w:eastAsia="Courier New"/>
-          <w:sz w:val="20"/>
+          <w:sz w:val="24"/>
         </w:rPr>
         <w:t>ctest --test-dir build --output-on-failure</w:t>
       </w:r>
@@ -2135,7 +2127,7 @@
       <w:r>
         <w:rPr>
           <w:rFonts w:ascii="Courier New" w:hAnsi="Courier New" w:eastAsia="Courier New"/>
-          <w:sz w:val="20"/>
+          <w:sz w:val="24"/>
         </w:rPr>
         <w:t>./build/variant_21</w:t>
       </w:r>
@@ -2210,7 +2202,7 @@
       <w:r>
         <w:rPr>
           <w:rFonts w:ascii="Courier New" w:hAnsi="Courier New" w:eastAsia="Courier New"/>
-          <w:sz w:val="20"/>
+          <w:sz w:val="24"/>
         </w:rPr>
         <w:t>const int exchange_rate[] = {</w:t>
       </w:r>
@@ -2220,7 +2212,7 @@
       <w:r>
         <w:rPr>
           <w:rFonts w:ascii="Courier New" w:hAnsi="Courier New" w:eastAsia="Courier New"/>
-          <w:sz w:val="20"/>
+          <w:sz w:val="24"/>
         </w:rPr>
         <w:t xml:space="preserve">    91, 93, 92, 95, 94,</w:t>
       </w:r>
@@ -2230,7 +2222,7 @@
       <w:r>
         <w:rPr>
           <w:rFonts w:ascii="Courier New" w:hAnsi="Courier New" w:eastAsia="Courier New"/>
-          <w:sz w:val="20"/>
+          <w:sz w:val="24"/>
         </w:rPr>
         <w:t xml:space="preserve">    96, 90, 89, 94, 97</w:t>
       </w:r>
@@ -2240,7 +2232,7 @@
       <w:r>
         <w:rPr>
           <w:rFonts w:ascii="Courier New" w:hAnsi="Courier New" w:eastAsia="Courier New"/>
-          <w:sz w:val="20"/>
+          <w:sz w:val="24"/>
         </w:rPr>
         <w:t>};</w:t>
       </w:r>
@@ -2250,9 +2242,19 @@
       <w:r>
         <w:rPr>
           <w:rFonts w:ascii="Courier New" w:hAnsi="Courier New" w:eastAsia="Courier New"/>
-          <w:sz w:val="20"/>
-        </w:rPr>
-        <w:t>const std::size_t n = sizeof(exchange_rate) / sizeof(exchange_rate[0]);</w:t>
+          <w:sz w:val="24"/>
+        </w:rPr>
+        <w:t>const std::size_t n =</w:t>
+      </w:r>
+      <w:r>
+        <w:br/>
+      </w:r>
+      <w:r>
+        <w:rPr>
+          <w:rFonts w:ascii="Courier New" w:hAnsi="Courier New" w:eastAsia="Courier New"/>
+          <w:sz w:val="24"/>
+        </w:rPr>
+        <w:t xml:space="preserve">    sizeof(exchange_rate) / sizeof(exchange_rate[0]);</w:t>
       </w:r>
     </w:p>
     <w:p>
@@ -3156,7 +3158,7 @@
       <w:r>
         <w:rPr>
           <w:rFonts w:ascii="Courier New" w:hAnsi="Courier New" w:eastAsia="Courier New"/>
-          <w:sz w:val="20"/>
+          <w:sz w:val="24"/>
         </w:rPr>
         <w:t>#include "arraylib.h"</w:t>
       </w:r>
@@ -3166,7 +3168,7 @@
       <w:r>
         <w:rPr>
           <w:rFonts w:ascii="Courier New" w:hAnsi="Courier New" w:eastAsia="Courier New"/>
-          <w:sz w:val="20"/>
+          <w:sz w:val="24"/>
         </w:rPr>
       </w:r>
       <w:r>
@@ -3175,7 +3177,7 @@
       <w:r>
         <w:rPr>
           <w:rFonts w:ascii="Courier New" w:hAnsi="Courier New" w:eastAsia="Courier New"/>
-          <w:sz w:val="20"/>
+          <w:sz w:val="24"/>
         </w:rPr>
         <w:t>#include &lt;cstddef&gt;</w:t>
       </w:r>
@@ -3185,7 +3187,7 @@
       <w:r>
         <w:rPr>
           <w:rFonts w:ascii="Courier New" w:hAnsi="Courier New" w:eastAsia="Courier New"/>
-          <w:sz w:val="20"/>
+          <w:sz w:val="24"/>
         </w:rPr>
         <w:t>#include &lt;iomanip&gt;</w:t>
       </w:r>
@@ -3195,7 +3197,7 @@
       <w:r>
         <w:rPr>
           <w:rFonts w:ascii="Courier New" w:hAnsi="Courier New" w:eastAsia="Courier New"/>
-          <w:sz w:val="20"/>
+          <w:sz w:val="24"/>
         </w:rPr>
         <w:t>#include &lt;iostream&gt;</w:t>
       </w:r>
@@ -3205,7 +3207,7 @@
       <w:r>
         <w:rPr>
           <w:rFonts w:ascii="Courier New" w:hAnsi="Courier New" w:eastAsia="Courier New"/>
-          <w:sz w:val="20"/>
+          <w:sz w:val="24"/>
         </w:rPr>
       </w:r>
       <w:r>
@@ -3214,7 +3216,7 @@
       <w:r>
         <w:rPr>
           <w:rFonts w:ascii="Courier New" w:hAnsi="Courier New" w:eastAsia="Courier New"/>
-          <w:sz w:val="20"/>
+          <w:sz w:val="24"/>
         </w:rPr>
         <w:t>int main() {</w:t>
       </w:r>
@@ -3224,7 +3226,7 @@
       <w:r>
         <w:rPr>
           <w:rFonts w:ascii="Courier New" w:hAnsi="Courier New" w:eastAsia="Courier New"/>
-          <w:sz w:val="20"/>
+          <w:sz w:val="24"/>
         </w:rPr>
         <w:t xml:space="preserve">    const int exchange_rate[] = {</w:t>
       </w:r>
@@ -3234,7 +3236,7 @@
       <w:r>
         <w:rPr>
           <w:rFonts w:ascii="Courier New" w:hAnsi="Courier New" w:eastAsia="Courier New"/>
-          <w:sz w:val="20"/>
+          <w:sz w:val="24"/>
         </w:rPr>
         <w:t xml:space="preserve">        91, 93, 92, 95, 94,</w:t>
       </w:r>
@@ -3244,7 +3246,7 @@
       <w:r>
         <w:rPr>
           <w:rFonts w:ascii="Courier New" w:hAnsi="Courier New" w:eastAsia="Courier New"/>
-          <w:sz w:val="20"/>
+          <w:sz w:val="24"/>
         </w:rPr>
         <w:t xml:space="preserve">        96, 90, 89, 94, 97</w:t>
       </w:r>
@@ -3254,7 +3256,7 @@
       <w:r>
         <w:rPr>
           <w:rFonts w:ascii="Courier New" w:hAnsi="Courier New" w:eastAsia="Courier New"/>
-          <w:sz w:val="20"/>
+          <w:sz w:val="24"/>
         </w:rPr>
         <w:t xml:space="preserve">    };</w:t>
       </w:r>
@@ -3264,9 +3266,9 @@
       <w:r>
         <w:rPr>
           <w:rFonts w:ascii="Courier New" w:hAnsi="Courier New" w:eastAsia="Courier New"/>
-          <w:sz w:val="20"/>
-        </w:rPr>
-        <w:t xml:space="preserve">    const std::size_t n = sizeof(exchange_rate) / sizeof(exchange_rate[0]);</w:t>
+          <w:sz w:val="24"/>
+        </w:rPr>
+        <w:t xml:space="preserve">    const std::size_t n =</w:t>
       </w:r>
       <w:r>
         <w:br/>
@@ -3274,8 +3276,9 @@
       <w:r>
         <w:rPr>
           <w:rFonts w:ascii="Courier New" w:hAnsi="Courier New" w:eastAsia="Courier New"/>
-          <w:sz w:val="20"/>
-        </w:rPr>
+          <w:sz w:val="24"/>
+        </w:rPr>
+        <w:t xml:space="preserve">        sizeof(exchange_rate) / sizeof(exchange_rate[0]);</w:t>
       </w:r>
       <w:r>
         <w:br/>
@@ -3283,7 +3286,16 @@
       <w:r>
         <w:rPr>
           <w:rFonts w:ascii="Courier New" w:hAnsi="Courier New" w:eastAsia="Courier New"/>
-          <w:sz w:val="20"/>
+          <w:sz w:val="24"/>
+        </w:rPr>
+      </w:r>
+      <w:r>
+        <w:br/>
+      </w:r>
+      <w:r>
+        <w:rPr>
+          <w:rFonts w:ascii="Courier New" w:hAnsi="Courier New" w:eastAsia="Courier New"/>
+          <w:sz w:val="24"/>
         </w:rPr>
         <w:t xml:space="preserve">    int days_above_93 = 0;</w:t>
       </w:r>
@@ -3293,7 +3305,7 @@
       <w:r>
         <w:rPr>
           <w:rFonts w:ascii="Courier New" w:hAnsi="Courier New" w:eastAsia="Courier New"/>
-          <w:sz w:val="20"/>
+          <w:sz w:val="24"/>
         </w:rPr>
         <w:t xml:space="preserve">    for (std::size_t i = 0; i &lt; n; ++i) {</w:t>
       </w:r>
@@ -3303,7 +3315,7 @@
       <w:r>
         <w:rPr>
           <w:rFonts w:ascii="Courier New" w:hAnsi="Courier New" w:eastAsia="Courier New"/>
-          <w:sz w:val="20"/>
+          <w:sz w:val="24"/>
         </w:rPr>
         <w:t xml:space="preserve">        if (exchange_rate[i] &gt; 93) ++days_above_93;</w:t>
       </w:r>
@@ -3313,7 +3325,7 @@
       <w:r>
         <w:rPr>
           <w:rFonts w:ascii="Courier New" w:hAnsi="Courier New" w:eastAsia="Courier New"/>
-          <w:sz w:val="20"/>
+          <w:sz w:val="24"/>
         </w:rPr>
         <w:t xml:space="preserve">    }</w:t>
       </w:r>
@@ -3323,7 +3335,7 @@
       <w:r>
         <w:rPr>
           <w:rFonts w:ascii="Courier New" w:hAnsi="Courier New" w:eastAsia="Courier New"/>
-          <w:sz w:val="20"/>
+          <w:sz w:val="24"/>
         </w:rPr>
       </w:r>
       <w:r>
@@ -3332,7 +3344,7 @@
       <w:r>
         <w:rPr>
           <w:rFonts w:ascii="Courier New" w:hAnsi="Courier New" w:eastAsia="Courier New"/>
-          <w:sz w:val="20"/>
+          <w:sz w:val="24"/>
         </w:rPr>
         <w:t xml:space="preserve">    std::cout &lt;&lt; "Курс по дням: ";</w:t>
       </w:r>
@@ -3342,7 +3354,7 @@
       <w:r>
         <w:rPr>
           <w:rFonts w:ascii="Courier New" w:hAnsi="Courier New" w:eastAsia="Courier New"/>
-          <w:sz w:val="20"/>
+          <w:sz w:val="24"/>
         </w:rPr>
         <w:t xml:space="preserve">    for (std::size_t i = 0; i &lt; n; ++i) {</w:t>
       </w:r>
@@ -3352,7 +3364,7 @@
       <w:r>
         <w:rPr>
           <w:rFonts w:ascii="Courier New" w:hAnsi="Courier New" w:eastAsia="Courier New"/>
-          <w:sz w:val="20"/>
+          <w:sz w:val="24"/>
         </w:rPr>
         <w:t xml:space="preserve">        if (i != 0) std::cout &lt;&lt; ", ";</w:t>
       </w:r>
@@ -3362,7 +3374,7 @@
       <w:r>
         <w:rPr>
           <w:rFonts w:ascii="Courier New" w:hAnsi="Courier New" w:eastAsia="Courier New"/>
-          <w:sz w:val="20"/>
+          <w:sz w:val="24"/>
         </w:rPr>
         <w:t xml:space="preserve">        std::cout &lt;&lt; exchange_rate[i];</w:t>
       </w:r>
@@ -3372,7 +3384,7 @@
       <w:r>
         <w:rPr>
           <w:rFonts w:ascii="Courier New" w:hAnsi="Courier New" w:eastAsia="Courier New"/>
-          <w:sz w:val="20"/>
+          <w:sz w:val="24"/>
         </w:rPr>
         <w:t xml:space="preserve">    }</w:t>
       </w:r>
@@ -3382,7 +3394,7 @@
       <w:r>
         <w:rPr>
           <w:rFonts w:ascii="Courier New" w:hAnsi="Courier New" w:eastAsia="Courier New"/>
-          <w:sz w:val="20"/>
+          <w:sz w:val="24"/>
         </w:rPr>
         <w:t xml:space="preserve">    std::cout &lt;&lt; '\n'</w:t>
       </w:r>
@@ -3392,9 +3404,9 @@
       <w:r>
         <w:rPr>
           <w:rFonts w:ascii="Courier New" w:hAnsi="Courier New" w:eastAsia="Courier New"/>
-          <w:sz w:val="20"/>
-        </w:rPr>
-        <w:t xml:space="preserve">              &lt;&lt; "Минимальный курс: " &lt;&lt; arr_min(exchange_rate, n) &lt;&lt; '\n'</w:t>
+          <w:sz w:val="24"/>
+        </w:rPr>
+        <w:t xml:space="preserve">              &lt;&lt; "Минимальный курс: "</w:t>
       </w:r>
       <w:r>
         <w:br/>
@@ -3402,9 +3414,9 @@
       <w:r>
         <w:rPr>
           <w:rFonts w:ascii="Courier New" w:hAnsi="Courier New" w:eastAsia="Courier New"/>
-          <w:sz w:val="20"/>
-        </w:rPr>
-        <w:t xml:space="preserve">              &lt;&lt; "Максимальный курс: " &lt;&lt; arr_max(exchange_rate, n) &lt;&lt; '\n'</w:t>
+          <w:sz w:val="24"/>
+        </w:rPr>
+        <w:t xml:space="preserve">              &lt;&lt; arr_min(exchange_rate, n) &lt;&lt; '\n'</w:t>
       </w:r>
       <w:r>
         <w:br/>
@@ -3412,9 +3424,9 @@
       <w:r>
         <w:rPr>
           <w:rFonts w:ascii="Courier New" w:hAnsi="Courier New" w:eastAsia="Courier New"/>
-          <w:sz w:val="20"/>
-        </w:rPr>
-        <w:t xml:space="preserve">              &lt;&lt; "Средний курс: " &lt;&lt; std::fixed &lt;&lt; std::setprecision(2)</w:t>
+          <w:sz w:val="24"/>
+        </w:rPr>
+        <w:t xml:space="preserve">              &lt;&lt; "Максимальный курс: "</w:t>
       </w:r>
       <w:r>
         <w:br/>
@@ -3422,7 +3434,37 @@
       <w:r>
         <w:rPr>
           <w:rFonts w:ascii="Courier New" w:hAnsi="Courier New" w:eastAsia="Courier New"/>
-          <w:sz w:val="20"/>
+          <w:sz w:val="24"/>
+        </w:rPr>
+        <w:t xml:space="preserve">              &lt;&lt; arr_max(exchange_rate, n) &lt;&lt; '\n'</w:t>
+      </w:r>
+      <w:r>
+        <w:br/>
+      </w:r>
+      <w:r>
+        <w:rPr>
+          <w:rFonts w:ascii="Courier New" w:hAnsi="Courier New" w:eastAsia="Courier New"/>
+          <w:sz w:val="24"/>
+        </w:rPr>
+        <w:t xml:space="preserve">              &lt;&lt; "Средний курс: " &lt;&lt; std::fixed</w:t>
+      </w:r>
+      <w:r>
+        <w:br/>
+      </w:r>
+      <w:r>
+        <w:rPr>
+          <w:rFonts w:ascii="Courier New" w:hAnsi="Courier New" w:eastAsia="Courier New"/>
+          <w:sz w:val="24"/>
+        </w:rPr>
+        <w:t xml:space="preserve">              &lt;&lt; std::setprecision(2)</w:t>
+      </w:r>
+      <w:r>
+        <w:br/>
+      </w:r>
+      <w:r>
+        <w:rPr>
+          <w:rFonts w:ascii="Courier New" w:hAnsi="Courier New" w:eastAsia="Courier New"/>
+          <w:sz w:val="24"/>
         </w:rPr>
         <w:t xml:space="preserve">              &lt;&lt; arr_average(exchange_rate, n) &lt;&lt; '\n'</w:t>
       </w:r>
@@ -3432,9 +3474,9 @@
       <w:r>
         <w:rPr>
           <w:rFonts w:ascii="Courier New" w:hAnsi="Courier New" w:eastAsia="Courier New"/>
-          <w:sz w:val="20"/>
-        </w:rPr>
-        <w:t xml:space="preserve">              &lt;&lt; "Медиана: " &lt;&lt; arr_median(exchange_rate, n) &lt;&lt; '\n'</w:t>
+          <w:sz w:val="24"/>
+        </w:rPr>
+        <w:t xml:space="preserve">              &lt;&lt; "Медиана: "</w:t>
       </w:r>
       <w:r>
         <w:br/>
@@ -3442,9 +3484,9 @@
       <w:r>
         <w:rPr>
           <w:rFonts w:ascii="Courier New" w:hAnsi="Courier New" w:eastAsia="Courier New"/>
-          <w:sz w:val="20"/>
-        </w:rPr>
-        <w:t xml:space="preserve">              &lt;&lt; "Дней с курсом выше 93: " &lt;&lt; days_above_93 &lt;&lt; '\n';</w:t>
+          <w:sz w:val="24"/>
+        </w:rPr>
+        <w:t xml:space="preserve">              &lt;&lt; arr_median(exchange_rate, n) &lt;&lt; '\n'</w:t>
       </w:r>
       <w:r>
         <w:br/>
@@ -3452,7 +3494,27 @@
       <w:r>
         <w:rPr>
           <w:rFonts w:ascii="Courier New" w:hAnsi="Courier New" w:eastAsia="Courier New"/>
-          <w:sz w:val="20"/>
+          <w:sz w:val="24"/>
+        </w:rPr>
+        <w:t xml:space="preserve">              &lt;&lt; "Дней с курсом выше 93: "</w:t>
+      </w:r>
+      <w:r>
+        <w:br/>
+      </w:r>
+      <w:r>
+        <w:rPr>
+          <w:rFonts w:ascii="Courier New" w:hAnsi="Courier New" w:eastAsia="Courier New"/>
+          <w:sz w:val="24"/>
+        </w:rPr>
+        <w:t xml:space="preserve">              &lt;&lt; days_above_93 &lt;&lt; '\n';</w:t>
+      </w:r>
+      <w:r>
+        <w:br/>
+      </w:r>
+      <w:r>
+        <w:rPr>
+          <w:rFonts w:ascii="Courier New" w:hAnsi="Courier New" w:eastAsia="Courier New"/>
+          <w:sz w:val="24"/>
         </w:rPr>
         <w:t xml:space="preserve">    return 0;</w:t>
       </w:r>
@@ -3462,7 +3524,7 @@
       <w:r>
         <w:rPr>
           <w:rFonts w:ascii="Courier New" w:hAnsi="Courier New" w:eastAsia="Courier New"/>
-          <w:sz w:val="20"/>
+          <w:sz w:val="24"/>
         </w:rPr>
         <w:t>}</w:t>
       </w:r>

</xml_diff>

<commit_message>
Add variant 21 flowchart to report
</commit_message>
<xml_diff>
--- a/Стакалов_АА_ИУ5-12-4_ЛР2_Алгоритмизация_программирование_2026.docx
+++ b/Стакалов_АА_ИУ5-12-4_ЛР2_Алгоритмизация_программирование_2026.docx
@@ -3527,6 +3527,113 @@
           <w:sz w:val="24"/>
         </w:rPr>
         <w:t>}</w:t>
+      </w:r>
+    </w:p>
+    <w:p>
+      <w:pPr>
+        <w:ind w:firstLine="0"/>
+      </w:pPr>
+      <w:r>
+        <w:br w:type="page"/>
+      </w:r>
+    </w:p>
+    <w:p>
+      <w:pPr>
+        <w:spacing w:line="240" w:lineRule="auto"/>
+        <w:ind w:firstLine="0"/>
+        <w:jc w:val="center"/>
+      </w:pPr>
+      <w:r>
+        <w:rPr>
+          <w:rFonts w:ascii="Times New Roman" w:hAnsi="Times New Roman" w:eastAsia="Times New Roman"/>
+          <w:b/>
+          <w:sz w:val="28"/>
+        </w:rPr>
+        <w:t>ПРИЛОЖЕНИЕ Б</w:t>
+      </w:r>
+    </w:p>
+    <w:p>
+      <w:pPr>
+        <w:spacing w:line="240" w:lineRule="auto"/>
+        <w:ind w:firstLine="0"/>
+        <w:jc w:val="center"/>
+      </w:pPr>
+      <w:r>
+        <w:rPr>
+          <w:rFonts w:ascii="Times New Roman" w:hAnsi="Times New Roman" w:eastAsia="Times New Roman"/>
+          <w:b/>
+          <w:sz w:val="28"/>
+        </w:rPr>
+        <w:t>Блок-схема программы варианта 21</w:t>
+      </w:r>
+    </w:p>
+    <w:p>
+      <w:pPr>
+        <w:spacing w:line="360" w:lineRule="auto" w:after="0"/>
+        <w:ind w:firstLine="0"/>
+        <w:jc w:val="both"/>
+      </w:pPr>
+      <w:r>
+        <w:rPr>
+          <w:rFonts w:ascii="Times New Roman" w:hAnsi="Times New Roman" w:eastAsia="Times New Roman"/>
+          <w:sz w:val="24"/>
+        </w:rPr>
+        <w:t>Схема показывает проверку массива, подсчёт дней с курсом выше 93 и вывод результатов.</w:t>
+      </w:r>
+    </w:p>
+    <w:p>
+      <w:pPr>
+        <w:spacing w:line="240" w:lineRule="auto" w:before="0" w:after="0"/>
+        <w:ind w:firstLine="0"/>
+        <w:jc w:val="center"/>
+      </w:pPr>
+      <w:r>
+        <w:drawing>
+          <wp:inline xmlns:a="http://schemas.openxmlformats.org/drawingml/2006/main" xmlns:pic="http://schemas.openxmlformats.org/drawingml/2006/picture">
+            <wp:extent cx="5688000" cy="7426000"/>
+            <wp:docPr id="2110396741" name="Picture 2110396741"/>
+            <wp:cNvGraphicFramePr>
+              <a:graphicFrameLocks noChangeAspect="1"/>
+            </wp:cNvGraphicFramePr>
+            <a:graphic>
+              <a:graphicData uri="http://schemas.openxmlformats.org/drawingml/2006/picture">
+                <pic:pic>
+                  <pic:nvPicPr>
+                    <pic:cNvPr id="0" name="flowchart_variant_21.png"/>
+                    <pic:cNvPicPr/>
+                  </pic:nvPicPr>
+                  <pic:blipFill>
+                    <a:blip r:embed="rId34"/>
+                    <a:stretch>
+                      <a:fillRect/>
+                    </a:stretch>
+                  </pic:blipFill>
+                  <pic:spPr>
+                    <a:xfrm>
+                      <a:off x="0" y="0"/>
+                      <a:ext cx="5688000" cy="7426000"/>
+                    </a:xfrm>
+                    <a:prstGeom prst="rect"/>
+                  </pic:spPr>
+                </pic:pic>
+              </a:graphicData>
+            </a:graphic>
+          </wp:inline>
+        </w:drawing>
+      </w:r>
+    </w:p>
+    <w:p>
+      <w:pPr>
+        <w:spacing w:line="240" w:lineRule="auto" w:before="60" w:after="0"/>
+        <w:ind w:firstLine="0"/>
+        <w:jc w:val="center"/>
+      </w:pPr>
+      <w:r>
+        <w:rPr>
+          <w:rFonts w:ascii="Times New Roman" w:hAnsi="Times New Roman" w:eastAsia="Times New Roman"/>
+          <w:sz w:val="24"/>
+        </w:rPr>
+        <w:t>Рисунок Б.1 — Блок-схема программы варианта 21</w:t>
       </w:r>
     </w:p>
     <w:sectPr>

</xml_diff>